<commit_message>
Main Web 18 Sep v2
</commit_message>
<xml_diff>
--- a/AtchisonRegime/assets/Template Active 70 Report - 2023 11 21.docx
+++ b/AtchisonRegime/assets/Template Active 70 Report - 2023 11 21.docx
@@ -5436,8 +5436,8 @@
 </file>
 
 <file path=customXml/item1.xml><?xml version="1.0" encoding="utf-8"?>
-<ct:contentTypeSchema xmlns:ct="http://schemas.microsoft.com/office/2006/metadata/contentType" xmlns:ma="http://schemas.microsoft.com/office/2006/metadata/properties/metaAttributes" ct:_="" ma:_="" ma:contentTypeName="Document" ma:contentTypeID="0x0101005C6577D0C3AE724BBB504F46D5A19401" ma:contentTypeVersion="17" ma:contentTypeDescription="Create a new document." ma:contentTypeScope="" ma:versionID="8f4062f565e2288d3ad2967a27c2ae54">
-  <xsd:schema xmlns:xsd="http://www.w3.org/2001/XMLSchema" xmlns:xs="http://www.w3.org/2001/XMLSchema" xmlns:p="http://schemas.microsoft.com/office/2006/metadata/properties" xmlns:ns2="df76e320-99cb-4a11-b59f-8bf32867ab70" xmlns:ns3="c0789f30-979e-497b-8344-faefb3987540" targetNamespace="http://schemas.microsoft.com/office/2006/metadata/properties" ma:root="true" ma:fieldsID="ecf204eb88fd8ff30fea00bdbc4a1953" ns2:_="" ns3:_="">
+<ct:contentTypeSchema xmlns:ct="http://schemas.microsoft.com/office/2006/metadata/contentType" xmlns:ma="http://schemas.microsoft.com/office/2006/metadata/properties/metaAttributes" ct:_="" ma:_="" ma:contentTypeName="Document" ma:contentTypeID="0x0101005C6577D0C3AE724BBB504F46D5A19401" ma:contentTypeVersion="18" ma:contentTypeDescription="Create a new document." ma:contentTypeScope="" ma:versionID="17afb16e0fbe716d3dcf2481b32b5550">
+  <xsd:schema xmlns:xsd="http://www.w3.org/2001/XMLSchema" xmlns:xs="http://www.w3.org/2001/XMLSchema" xmlns:p="http://schemas.microsoft.com/office/2006/metadata/properties" xmlns:ns2="df76e320-99cb-4a11-b59f-8bf32867ab70" xmlns:ns3="c0789f30-979e-497b-8344-faefb3987540" targetNamespace="http://schemas.microsoft.com/office/2006/metadata/properties" ma:root="true" ma:fieldsID="f6d0bb8d4e6a5d6b988ea2ed2503dbb5" ns2:_="" ns3:_="">
     <xsd:import namespace="df76e320-99cb-4a11-b59f-8bf32867ab70"/>
     <xsd:import namespace="c0789f30-979e-497b-8344-faefb3987540"/>
     <xsd:element name="properties">
@@ -5462,6 +5462,7 @@
                 <xsd:element ref="ns3:TaxCatchAll" minOccurs="0"/>
                 <xsd:element ref="ns2:MediaServiceLocation" minOccurs="0"/>
                 <xsd:element ref="ns2:MediaServiceObjectDetectorVersions" minOccurs="0"/>
+                <xsd:element ref="ns2:MediaServiceSearchProperties" minOccurs="0"/>
               </xsd:all>
             </xsd:complexType>
           </xsd:element>
@@ -5541,6 +5542,11 @@
     <xsd:element name="MediaServiceObjectDetectorVersions" ma:index="24" nillable="true" ma:displayName="MediaServiceObjectDetectorVersions" ma:description="" ma:hidden="true" ma:indexed="true" ma:internalName="MediaServiceObjectDetectorVersions" ma:readOnly="true">
       <xsd:simpleType>
         <xsd:restriction base="dms:Text"/>
+      </xsd:simpleType>
+    </xsd:element>
+    <xsd:element name="MediaServiceSearchProperties" ma:index="25" nillable="true" ma:displayName="MediaServiceSearchProperties" ma:hidden="true" ma:internalName="MediaServiceSearchProperties" ma:readOnly="true">
+      <xsd:simpleType>
+        <xsd:restriction base="dms:Note"/>
       </xsd:simpleType>
     </xsd:element>
   </xsd:schema>
@@ -5709,22 +5715,7 @@
 </file>
 
 <file path=customXml/itemProps1.xml><?xml version="1.0" encoding="utf-8"?>
-<ds:datastoreItem xmlns:ds="http://schemas.openxmlformats.org/officeDocument/2006/customXml" ds:itemID="{4DA2756B-D2C5-4EDF-93FB-12CC2BBDAE72}">
-  <ds:schemaRefs>
-    <ds:schemaRef ds:uri="http://schemas.microsoft.com/office/2006/metadata/contentType"/>
-    <ds:schemaRef ds:uri="http://schemas.microsoft.com/office/2006/metadata/properties/metaAttributes"/>
-    <ds:schemaRef ds:uri="http://www.w3.org/2001/XMLSchema"/>
-    <ds:schemaRef ds:uri="http://schemas.microsoft.com/office/2006/metadata/properties"/>
-    <ds:schemaRef ds:uri="df76e320-99cb-4a11-b59f-8bf32867ab70"/>
-    <ds:schemaRef ds:uri="c0789f30-979e-497b-8344-faefb3987540"/>
-    <ds:schemaRef ds:uri="http://schemas.microsoft.com/office/2006/documentManagement/types"/>
-    <ds:schemaRef ds:uri="http://schemas.microsoft.com/office/infopath/2007/PartnerControls"/>
-    <ds:schemaRef ds:uri="http://schemas.openxmlformats.org/package/2006/metadata/core-properties"/>
-    <ds:schemaRef ds:uri="http://purl.org/dc/elements/1.1/"/>
-    <ds:schemaRef ds:uri="http://purl.org/dc/terms/"/>
-    <ds:schemaRef ds:uri="http://schemas.microsoft.com/internal/obd"/>
-  </ds:schemaRefs>
-</ds:datastoreItem>
+<ds:datastoreItem xmlns:ds="http://schemas.openxmlformats.org/officeDocument/2006/customXml" ds:itemID="{F7F9DA11-3207-45D3-89A1-9D3C9E05173F}"/>
 </file>
 
 <file path=customXml/itemProps2.xml><?xml version="1.0" encoding="utf-8"?>

</xml_diff>